<commit_message>
Reduce restoring_div diagram to fit in document
</commit_message>
<xml_diff>
--- a/docs/dividers/dividers.docx
+++ b/docs/dividers/dividers.docx
@@ -601,18 +601,18 @@
       <w:r>
         <w:lastRenderedPageBreak/>
         <w:drawing>
-          <wp:anchor distT="0" distB="0" distL="114300" distR="114300" simplePos="0" relativeHeight="251658240" behindDoc="0" locked="0" layoutInCell="1" allowOverlap="1" wp14:anchorId="40AE2EE4" wp14:editId="0862B202">
+          <wp:anchor distT="0" distB="0" distL="114300" distR="114300" simplePos="0" relativeHeight="251658240" behindDoc="0" locked="0" layoutInCell="1" allowOverlap="1" wp14:anchorId="0ACE06B9" wp14:editId="13D6BD96">
             <wp:simplePos x="0" y="0"/>
-            <wp:positionH relativeFrom="page">
-              <wp:posOffset>75565</wp:posOffset>
+            <wp:positionH relativeFrom="margin">
+              <wp:align>center</wp:align>
             </wp:positionH>
             <wp:positionV relativeFrom="paragraph">
               <wp:posOffset>0</wp:posOffset>
             </wp:positionV>
-            <wp:extent cx="7642225" cy="2404745"/>
-            <wp:effectExtent l="0" t="0" r="0" b="0"/>
+            <wp:extent cx="7070725" cy="2912745"/>
+            <wp:effectExtent l="0" t="0" r="0" b="1905"/>
             <wp:wrapSquare wrapText="bothSides"/>
-            <wp:docPr id="477195169" name="Picture 1" descr="The provided text appears to be a technical description of a digital circuit or logic diagram, likely from a digital electronics textbook or a similar resource. It includes various components such as signals, multiplexers (Mux), subtraction, and comparison operations, as well as some binary arithmetic instructions. However, without an actual image, I cannot describe it.&#10;&#10;AI-generated content may be incorrect."/>
+            <wp:docPr id="1528590595" name="Picture 1" descr="The diagram illustrates a digital circuit with various components such as signals, multiplexers, and subtraction logic, indicating the flow and operations between different signal states and inputs.&#10;&#10;AI-generated content may be incorrect."/>
             <wp:cNvGraphicFramePr>
               <a:graphicFrameLocks xmlns:a="http://schemas.openxmlformats.org/drawingml/2006/main" noChangeAspect="1"/>
             </wp:cNvGraphicFramePr>
@@ -620,11 +620,11 @@
               <a:graphicData uri="http://schemas.openxmlformats.org/drawingml/2006/picture">
                 <pic:pic xmlns:pic="http://schemas.openxmlformats.org/drawingml/2006/picture">
                   <pic:nvPicPr>
-                    <pic:cNvPr id="477195169" name="Picture 1" descr="The provided text appears to be a technical description of a digital circuit or logic diagram, likely from a digital electronics textbook or a similar resource. It includes various components such as signals, multiplexers (Mux), subtraction, and comparison operations, as well as some binary arithmetic instructions. However, without an actual image, I cannot describe it.&#10;&#10;AI-generated content may be incorrect."/>
+                    <pic:cNvPr id="1528590595" name="Picture 1" descr="The diagram illustrates a digital circuit with various components such as signals, multiplexers, and subtraction logic, indicating the flow and operations between different signal states and inputs.&#10;&#10;AI-generated content may be incorrect."/>
                     <pic:cNvPicPr/>
                   </pic:nvPicPr>
                   <pic:blipFill>
-                    <a:blip r:embed="rId6" cstate="print">
+                    <a:blip r:embed="rId6">
                       <a:extLst>
                         <a:ext uri="{28A0092B-C50C-407E-A947-70E740481C1C}">
                           <a14:useLocalDpi xmlns:a14="http://schemas.microsoft.com/office/drawing/2010/main" val="0"/>
@@ -638,7 +638,7 @@
                   <pic:spPr>
                     <a:xfrm>
                       <a:off x="0" y="0"/>
-                      <a:ext cx="7642225" cy="2404745"/>
+                      <a:ext cx="7070725" cy="2912745"/>
                     </a:xfrm>
                     <a:prstGeom prst="rect">
                       <a:avLst/>

</xml_diff>